<commit_message>
Add register fitness fields and doc report
</commit_message>
<xml_diff>
--- a/docs/bao_cao_GR1.docx
+++ b/docs/bao_cao_GR1.docx
@@ -1,6 +1,6 @@
 
 <file path=word/document.xml><?xml version="1.0" encoding="utf-8"?>
-<w:document xmlns:wpc="http://schemas.microsoft.com/office/word/2010/wordprocessingCanvas" xmlns:cx="http://schemas.microsoft.com/office/drawing/2014/chartex" xmlns:cx1="http://schemas.microsoft.com/office/drawing/2015/9/8/chartex" xmlns:cx2="http://schemas.microsoft.com/office/drawing/2015/10/21/chartex" xmlns:cx3="http://schemas.microsoft.com/office/drawing/2016/5/9/chartex" xmlns:cx4="http://schemas.microsoft.com/office/drawing/2016/5/10/chartex" xmlns:cx5="http://schemas.microsoft.com/office/drawing/2016/5/11/chartex" xmlns:cx6="http://schemas.microsoft.com/office/drawing/2016/5/12/chartex" xmlns:cx7="http://schemas.microsoft.com/office/drawing/2016/5/13/chartex" xmlns:cx8="http://schemas.microsoft.com/office/drawing/2016/5/14/chartex" xmlns:mc="http://schemas.openxmlformats.org/markup-compatibility/2006" xmlns:m="http://schemas.openxmlformats.org/officeDocument/2006/math" xmlns:aink="http://schemas.microsoft.com/office/drawing/2016/ink" xmlns:am3d="http://schemas.microsoft.com/office/drawing/2017/model3d" xmlns:oel="http://schemas.microsoft.com/office/2019/extlst" xmlns:r="http://schemas.openxmlformats.org/officeDocument/2006/relationships" xmlns:wp14="http://schemas.microsoft.com/office/word/2010/wordprocessingDrawing" xmlns:wp="http://schemas.openxmlformats.org/drawingml/2006/wordprocessingDrawing" xmlns:wpg="http://schemas.microsoft.com/office/word/2010/wordprocessingGroup" xmlns:wpi="http://schemas.microsoft.com/office/word/2010/wordprocessingInk" xmlns:wps="http://schemas.microsoft.com/office/word/2010/wordprocessingShape" xmlns:o="urn:schemas-microsoft-com:office:office" xmlns:v="urn:schemas-microsoft-com:vml" xmlns:w10="urn:schemas-microsoft-com:office:word" xmlns:w="http://schemas.openxmlformats.org/wordprocessingml/2006/main" xmlns:w14="http://schemas.microsoft.com/office/word/2010/wordml" xmlns:w15="http://schemas.microsoft.com/office/word/2012/wordml" xmlns:w16cex="http://schemas.microsoft.com/office/word/2018/wordml/cex" xmlns:w16cid="http://schemas.microsoft.com/office/word/2016/wordml/cid" xmlns:w16="http://schemas.microsoft.com/office/word/2018/wordml" xmlns:w16sdtdh="http://schemas.microsoft.com/office/word/2020/wordml/sdtdatahash" xmlns:w16sdtfl="http://schemas.microsoft.com/office/word/2024/wordml/sdtformatlock" xmlns:w16se="http://schemas.microsoft.com/office/word/2015/wordml/symex" xmlns:w16du="http://schemas.microsoft.com/office/word/2023/wordml/word16du" xmlns:wne="http://schemas.microsoft.com/office/word/2006/wordml" mc:Ignorable="w14 w15 w16se w16cid w16 w16cex w16sdtdh w16sdtfl w16du wp14">
+<w:document xmlns:wpc="http://schemas.microsoft.com/office/word/2010/wordprocessingCanvas" xmlns:cx="http://schemas.microsoft.com/office/drawing/2014/chartex" xmlns:cx1="http://schemas.microsoft.com/office/drawing/2015/9/8/chartex" xmlns:cx2="http://schemas.microsoft.com/office/drawing/2015/10/21/chartex" xmlns:cx3="http://schemas.microsoft.com/office/drawing/2016/5/9/chartex" xmlns:cx4="http://schemas.microsoft.com/office/drawing/2016/5/10/chartex" xmlns:cx5="http://schemas.microsoft.com/office/drawing/2016/5/11/chartex" xmlns:cx6="http://schemas.microsoft.com/office/drawing/2016/5/12/chartex" xmlns:cx7="http://schemas.microsoft.com/office/drawing/2016/5/13/chartex" xmlns:cx8="http://schemas.microsoft.com/office/drawing/2016/5/14/chartex" xmlns:mc="http://schemas.openxmlformats.org/markup-compatibility/2006" xmlns:aink="http://schemas.microsoft.com/office/drawing/2016/ink" xmlns:am3d="http://schemas.microsoft.com/office/drawing/2017/model3d" xmlns:o="urn:schemas-microsoft-com:office:office" xmlns:oel="http://schemas.microsoft.com/office/2019/extlst" xmlns:r="http://schemas.openxmlformats.org/officeDocument/2006/relationships" xmlns:m="http://schemas.openxmlformats.org/officeDocument/2006/math" xmlns:v="urn:schemas-microsoft-com:vml" xmlns:wp14="http://schemas.microsoft.com/office/word/2010/wordprocessingDrawing" xmlns:wp="http://schemas.openxmlformats.org/drawingml/2006/wordprocessingDrawing" xmlns:w10="urn:schemas-microsoft-com:office:word" xmlns:w="http://schemas.openxmlformats.org/wordprocessingml/2006/main" xmlns:w14="http://schemas.microsoft.com/office/word/2010/wordml" xmlns:w15="http://schemas.microsoft.com/office/word/2012/wordml" xmlns:w16cex="http://schemas.microsoft.com/office/word/2018/wordml/cex" xmlns:w16cid="http://schemas.microsoft.com/office/word/2016/wordml/cid" xmlns:w16="http://schemas.microsoft.com/office/word/2018/wordml" xmlns:w16du="http://schemas.microsoft.com/office/word/2023/wordml/word16du" xmlns:w16sdtdh="http://schemas.microsoft.com/office/word/2020/wordml/sdtdatahash" xmlns:w16sdtfl="http://schemas.microsoft.com/office/word/2024/wordml/sdtformatlock" xmlns:w16se="http://schemas.microsoft.com/office/word/2015/wordml/symex" xmlns:wpg="http://schemas.microsoft.com/office/word/2010/wordprocessingGroup" xmlns:wpi="http://schemas.microsoft.com/office/word/2010/wordprocessingInk" xmlns:wne="http://schemas.microsoft.com/office/word/2006/wordml" xmlns:wps="http://schemas.microsoft.com/office/word/2010/wordprocessingShape" mc:Ignorable="w14 w15 w16se w16cid w16 w16cex w16sdtdh w16sdtfl w16du wp14">
   <w:body>
     <w:p>
       <w:pPr>
@@ -217,14 +217,7 @@
           <w:rFonts w:cs="Times New Roman"/>
           <w:lang w:val="vi-VN"/>
         </w:rPr>
-        <w:t xml:space="preserve">Supervisor: Professor </w:t>
-      </w:r>
-      <w:r>
-        <w:rPr>
-          <w:rFonts w:cs="Times New Roman"/>
-          <w:lang w:val="vi-VN"/>
-        </w:rPr>
-        <w:t>Cao Tuan Dung</w:t>
+        <w:t>Supervisor: Professor Cao Tuan Dung</w:t>
       </w:r>
     </w:p>
     <w:p>
@@ -348,7 +341,12 @@
     <w:sdt>
       <w:sdtPr>
         <w:rPr>
-          <w:rFonts w:cs="Times New Roman"/>
+          <w:rFonts w:eastAsiaTheme="minorEastAsia" w:cs="Times New Roman"/>
+          <w:b w:val="0"/>
+          <w:bCs w:val="0"/>
+          <w:color w:val="auto"/>
+          <w:sz w:val="26"/>
+          <w:szCs w:val="22"/>
         </w:rPr>
         <w:id w:val="1021360071"/>
         <w:docPartObj>
@@ -358,11 +356,7 @@
       </w:sdtPr>
       <w:sdtEndPr>
         <w:rPr>
-          <w:rFonts w:eastAsiaTheme="minorEastAsia"/>
           <w:noProof/>
-          <w:color w:val="auto"/>
-          <w:sz w:val="26"/>
-          <w:szCs w:val="22"/>
         </w:rPr>
       </w:sdtEndPr>
       <w:sdtContent>
@@ -8147,14 +8141,18 @@
             <w:pPr>
               <w:rPr>
                 <w:rFonts w:cs="Times New Roman"/>
-              </w:rPr>
-            </w:pPr>
-            <w:r>
-              <w:rPr>
-                <w:rFonts w:cs="Times New Roman"/>
-                <w:sz w:val="20"/>
-              </w:rPr>
-              <w:t>**GR1**</w:t>
+                <w:b/>
+                <w:bCs/>
+              </w:rPr>
+            </w:pPr>
+            <w:r>
+              <w:rPr>
+                <w:rFonts w:cs="Times New Roman"/>
+                <w:b/>
+                <w:bCs/>
+                <w:sz w:val="20"/>
+              </w:rPr>
+              <w:t>GR1</w:t>
             </w:r>
           </w:p>
         </w:tc>
@@ -8173,7 +8171,7 @@
                 <w:rFonts w:cs="Times New Roman"/>
                 <w:sz w:val="20"/>
               </w:rPr>
-              <w:t>[CẦN BỔ SUNG: Semester]</w:t>
+              <w:t>2025.2</w:t>
             </w:r>
           </w:p>
         </w:tc>
@@ -8217,15 +8215,19 @@
             <w:pPr>
               <w:rPr>
                 <w:rFonts w:cs="Times New Roman"/>
-              </w:rPr>
-            </w:pPr>
-            <w:r>
-              <w:rPr>
-                <w:rFonts w:cs="Times New Roman"/>
+                <w:b/>
+                <w:bCs/>
+              </w:rPr>
+            </w:pPr>
+            <w:r>
+              <w:rPr>
+                <w:rFonts w:cs="Times New Roman"/>
+                <w:b/>
+                <w:bCs/>
                 <w:sz w:val="20"/>
               </w:rPr>
               <w:lastRenderedPageBreak/>
-              <w:t>**GR2**</w:t>
+              <w:t>GR2</w:t>
             </w:r>
           </w:p>
         </w:tc>
@@ -8244,7 +8246,7 @@
                 <w:rFonts w:cs="Times New Roman"/>
                 <w:sz w:val="20"/>
               </w:rPr>
-              <w:t>[CẦN BỔ SUNG: Semester]</w:t>
+              <w:t>2026.1</w:t>
             </w:r>
           </w:p>
         </w:tc>
@@ -8264,68 +8266,6 @@
                 <w:sz w:val="20"/>
               </w:rPr>
               <w:t>AI service integration (Flask/FastAPI): chatbot, exercise recommendation, equipment recognition. Enhanced UI/UX. Performance optimization.</w:t>
-            </w:r>
-          </w:p>
-        </w:tc>
-      </w:tr>
-      <w:tr>
-        <w:trPr>
-          <w:jc w:val="center"/>
-        </w:trPr>
-        <w:tc>
-          <w:tcPr>
-            <w:tcW w:w="3135" w:type="dxa"/>
-          </w:tcPr>
-          <w:p>
-            <w:pPr>
-              <w:rPr>
-                <w:rFonts w:cs="Times New Roman"/>
-              </w:rPr>
-            </w:pPr>
-            <w:r>
-              <w:rPr>
-                <w:rFonts w:cs="Times New Roman"/>
-                <w:sz w:val="20"/>
-              </w:rPr>
-              <w:t>**Thesis (ĐATN)**</w:t>
-            </w:r>
-          </w:p>
-        </w:tc>
-        <w:tc>
-          <w:tcPr>
-            <w:tcW w:w="3135" w:type="dxa"/>
-          </w:tcPr>
-          <w:p>
-            <w:pPr>
-              <w:rPr>
-                <w:rFonts w:cs="Times New Roman"/>
-              </w:rPr>
-            </w:pPr>
-            <w:r>
-              <w:rPr>
-                <w:rFonts w:cs="Times New Roman"/>
-                <w:sz w:val="20"/>
-              </w:rPr>
-              <w:t>[CẦN BỔ SUNG: Semester]</w:t>
-            </w:r>
-          </w:p>
-        </w:tc>
-        <w:tc>
-          <w:tcPr>
-            <w:tcW w:w="3135" w:type="dxa"/>
-          </w:tcPr>
-          <w:p>
-            <w:pPr>
-              <w:rPr>
-                <w:rFonts w:cs="Times New Roman"/>
-              </w:rPr>
-            </w:pPr>
-            <w:r>
-              <w:rPr>
-                <w:rFonts w:cs="Times New Roman"/>
-                <w:sz w:val="20"/>
-              </w:rPr>
-              <w:t>Posture analysis via computer vision. Production-grade deployment. Comprehensive user evaluation and academic writing.</w:t>
             </w:r>
           </w:p>
         </w:tc>
@@ -8333,15 +8273,8 @@
     </w:tbl>
     <w:p>
       <w:pPr>
-        <w:rPr>
-          <w:rFonts w:cs="Times New Roman"/>
-        </w:rPr>
-      </w:pPr>
-    </w:p>
-    <w:p>
-      <w:pPr>
         <w:spacing w:before="60" w:after="120"/>
-        <w:ind w:firstLine="567"/>
+        <w:ind w:firstLine="720"/>
         <w:rPr>
           <w:rFonts w:cs="Times New Roman"/>
         </w:rPr>
@@ -8506,7 +8439,6 @@
         <w:rPr>
           <w:rFonts w:cs="Times New Roman"/>
         </w:rPr>
-        <w:lastRenderedPageBreak/>
         <w:t>2.2 Comparative Analysis</w:t>
       </w:r>
       <w:bookmarkEnd w:id="8"/>
@@ -8688,6 +8620,7 @@
                 <w:rFonts w:cs="Times New Roman"/>
                 <w:sz w:val="20"/>
               </w:rPr>
+              <w:lastRenderedPageBreak/>
               <w:t>Exercise Library with GIF</w:t>
             </w:r>
           </w:p>
@@ -10275,67 +10208,67 @@
           <w:rFonts w:cs="Times New Roman"/>
           <w:sz w:val="24"/>
         </w:rPr>
+        <w:t>Workout session tracking with set/rep/weight logging.</w:t>
+      </w:r>
+    </w:p>
+    <w:p>
+      <w:pPr>
+        <w:pStyle w:val="ListBullet"/>
+        <w:rPr>
+          <w:rFonts w:cs="Times New Roman"/>
+        </w:rPr>
+      </w:pPr>
+      <w:r>
+        <w:rPr>
+          <w:rFonts w:cs="Times New Roman"/>
+          <w:sz w:val="24"/>
+        </w:rPr>
+        <w:t>Trainer profile system with certificate-based verification.</w:t>
+      </w:r>
+    </w:p>
+    <w:p>
+      <w:pPr>
+        <w:pStyle w:val="ListBullet"/>
+        <w:rPr>
+          <w:rFonts w:cs="Times New Roman"/>
+        </w:rPr>
+      </w:pPr>
+      <w:r>
+        <w:rPr>
+          <w:rFonts w:cs="Times New Roman"/>
+          <w:sz w:val="24"/>
+        </w:rPr>
+        <w:t>User–Trainer connection workflow with request management.</w:t>
+      </w:r>
+    </w:p>
+    <w:p>
+      <w:pPr>
+        <w:pStyle w:val="ListBullet"/>
+        <w:rPr>
+          <w:rFonts w:cs="Times New Roman"/>
+        </w:rPr>
+      </w:pPr>
+      <w:r>
+        <w:rPr>
+          <w:rFonts w:cs="Times New Roman"/>
+          <w:sz w:val="24"/>
+        </w:rPr>
+        <w:t>Rating and review system for trainers.</w:t>
+      </w:r>
+    </w:p>
+    <w:p>
+      <w:pPr>
+        <w:pStyle w:val="ListBullet"/>
+        <w:rPr>
+          <w:rFonts w:cs="Times New Roman"/>
+        </w:rPr>
+      </w:pPr>
+      <w:r>
+        <w:rPr>
+          <w:rFonts w:cs="Times New Roman"/>
+          <w:sz w:val="24"/>
+        </w:rPr>
         <w:lastRenderedPageBreak/>
-        <w:t>Workout session tracking with set/rep/weight logging.</w:t>
-      </w:r>
-    </w:p>
-    <w:p>
-      <w:pPr>
-        <w:pStyle w:val="ListBullet"/>
-        <w:rPr>
-          <w:rFonts w:cs="Times New Roman"/>
-        </w:rPr>
-      </w:pPr>
-      <w:r>
-        <w:rPr>
-          <w:rFonts w:cs="Times New Roman"/>
-          <w:sz w:val="24"/>
-        </w:rPr>
-        <w:t>Trainer profile system with certificate-based verification.</w:t>
-      </w:r>
-    </w:p>
-    <w:p>
-      <w:pPr>
-        <w:pStyle w:val="ListBullet"/>
-        <w:rPr>
-          <w:rFonts w:cs="Times New Roman"/>
-        </w:rPr>
-      </w:pPr>
-      <w:r>
-        <w:rPr>
-          <w:rFonts w:cs="Times New Roman"/>
-          <w:sz w:val="24"/>
-        </w:rPr>
-        <w:t>User–Trainer connection workflow with request management.</w:t>
-      </w:r>
-    </w:p>
-    <w:p>
-      <w:pPr>
-        <w:pStyle w:val="ListBullet"/>
-        <w:rPr>
-          <w:rFonts w:cs="Times New Roman"/>
-        </w:rPr>
-      </w:pPr>
-      <w:r>
-        <w:rPr>
-          <w:rFonts w:cs="Times New Roman"/>
-          <w:sz w:val="24"/>
-        </w:rPr>
-        <w:t>Rating and review system for trainers.</w:t>
-      </w:r>
-    </w:p>
-    <w:p>
-      <w:pPr>
-        <w:pStyle w:val="ListBullet"/>
-        <w:rPr>
-          <w:rFonts w:cs="Times New Roman"/>
-        </w:rPr>
-      </w:pPr>
-      <w:r>
-        <w:rPr>
-          <w:rFonts w:cs="Times New Roman"/>
-          <w:sz w:val="24"/>
-        </w:rPr>
         <w:t>Real-time chat between connected users and trainers.</w:t>
       </w:r>
     </w:p>
@@ -10634,37 +10567,37 @@
           <w:rFonts w:cs="Times New Roman"/>
           <w:sz w:val="24"/>
         </w:rPr>
+        <w:t>Consistent response format: All responses follow a standardized JSON envelope: `{ "success": true/false, "data": {...}, "message": "..." }`.</w:t>
+      </w:r>
+    </w:p>
+    <w:p>
+      <w:pPr>
+        <w:pStyle w:val="ListBullet"/>
+        <w:rPr>
+          <w:rFonts w:cs="Times New Roman"/>
+        </w:rPr>
+      </w:pPr>
+      <w:r>
+        <w:rPr>
+          <w:rFonts w:cs="Times New Roman"/>
+          <w:sz w:val="24"/>
+        </w:rPr>
+        <w:t>Pagination: List endpoints return paginated results with `items`, `page`, `limit`, `total`, and `totalPages` fields.</w:t>
+      </w:r>
+    </w:p>
+    <w:p>
+      <w:pPr>
+        <w:pStyle w:val="ListBullet"/>
+        <w:rPr>
+          <w:rFonts w:cs="Times New Roman"/>
+        </w:rPr>
+      </w:pPr>
+      <w:r>
+        <w:rPr>
+          <w:rFonts w:cs="Times New Roman"/>
+          <w:sz w:val="24"/>
+        </w:rPr>
         <w:lastRenderedPageBreak/>
-        <w:t>Consistent response format: All responses follow a standardized JSON envelope: `{ "success": true/false, "data": {...}, "message": "..." }`.</w:t>
-      </w:r>
-    </w:p>
-    <w:p>
-      <w:pPr>
-        <w:pStyle w:val="ListBullet"/>
-        <w:rPr>
-          <w:rFonts w:cs="Times New Roman"/>
-        </w:rPr>
-      </w:pPr>
-      <w:r>
-        <w:rPr>
-          <w:rFonts w:cs="Times New Roman"/>
-          <w:sz w:val="24"/>
-        </w:rPr>
-        <w:t>Pagination: List endpoints return paginated results with `items`, `page`, `limit`, `total`, and `totalPages` fields.</w:t>
-      </w:r>
-    </w:p>
-    <w:p>
-      <w:pPr>
-        <w:pStyle w:val="ListBullet"/>
-        <w:rPr>
-          <w:rFonts w:cs="Times New Roman"/>
-        </w:rPr>
-      </w:pPr>
-      <w:r>
-        <w:rPr>
-          <w:rFonts w:cs="Times New Roman"/>
-          <w:sz w:val="24"/>
-        </w:rPr>
         <w:t>Error format: Errors include machine-readable `code`, human-readable `message`, and optional `details` for validation errors.</w:t>
       </w:r>
     </w:p>
@@ -10908,7 +10841,6 @@
         <w:rPr>
           <w:rFonts w:cs="Times New Roman"/>
         </w:rPr>
-        <w:lastRenderedPageBreak/>
         <w:t>3.3 Real-Time Communication with WebSocket</w:t>
       </w:r>
       <w:bookmarkEnd w:id="14"/>
@@ -10940,6 +10872,7 @@
           <w:rFonts w:cs="Times New Roman"/>
           <w:sz w:val="24"/>
         </w:rPr>
+        <w:lastRenderedPageBreak/>
         <w:t>Notifications: When the backend creates a database notification (e.g., connection request approved, exercise submission reviewed), it simultaneously emits a `notification:new` event to the recipient's Socket.IO room. The client displays a toast notification and updates the unread badge count.</w:t>
       </w:r>
     </w:p>
@@ -11167,22 +11100,22 @@
           <w:rFonts w:cs="Times New Roman"/>
           <w:sz w:val="24"/>
         </w:rPr>
+        <w:t>Distributed rate limiting: Two rate limiters protect the API:</w:t>
+      </w:r>
+    </w:p>
+    <w:p>
+      <w:pPr>
+        <w:pStyle w:val="ListBullet"/>
+        <w:rPr>
+          <w:rFonts w:cs="Times New Roman"/>
+        </w:rPr>
+      </w:pPr>
+      <w:r>
+        <w:rPr>
+          <w:rFonts w:cs="Times New Roman"/>
+          <w:sz w:val="24"/>
+        </w:rPr>
         <w:lastRenderedPageBreak/>
-        <w:t>Distributed rate limiting: Two rate limiters protect the API:</w:t>
-      </w:r>
-    </w:p>
-    <w:p>
-      <w:pPr>
-        <w:pStyle w:val="ListBullet"/>
-        <w:rPr>
-          <w:rFonts w:cs="Times New Roman"/>
-        </w:rPr>
-      </w:pPr>
-      <w:r>
-        <w:rPr>
-          <w:rFonts w:cs="Times New Roman"/>
-          <w:sz w:val="24"/>
-        </w:rPr>
         <w:t>Auth rate limiter: 20 requests per 15-minute window on authentication endpoints, preventing brute-force attacks.</w:t>
       </w:r>
     </w:p>
@@ -13872,14 +13805,12 @@
         </w:rPr>
         <w:t xml:space="preserve">Chapter 4 – </w:t>
       </w:r>
-      <w:proofErr w:type="spellStart"/>
       <w:r>
         <w:rPr>
           <w:rFonts w:cs="Times New Roman"/>
         </w:rPr>
         <w:t>FiFB</w:t>
       </w:r>
-      <w:proofErr w:type="spellEnd"/>
       <w:r>
         <w:rPr>
           <w:rFonts w:cs="Times New Roman"/>
@@ -22092,21 +22023,7 @@
         <w:rPr>
           <w:rFonts w:cs="Times New Roman"/>
         </w:rPr>
-        <w:t>The Render Blueprint (</w:t>
-      </w:r>
-      <w:proofErr w:type="gramStart"/>
-      <w:r>
-        <w:rPr>
-          <w:rFonts w:cs="Times New Roman"/>
-        </w:rPr>
-        <w:t>render.yaml</w:t>
-      </w:r>
-      <w:proofErr w:type="gramEnd"/>
-      <w:r>
-        <w:rPr>
-          <w:rFonts w:cs="Times New Roman"/>
-        </w:rPr>
-        <w:t>) configures:</w:t>
+        <w:t>The Render Blueprint (render.yaml) configures:</w:t>
       </w:r>
     </w:p>
     <w:p>
@@ -26076,7 +25993,7 @@
 </file>
 
 <file path=word/endnotes.xml><?xml version="1.0" encoding="utf-8"?>
-<w:endnotes xmlns:wpc="http://schemas.microsoft.com/office/word/2010/wordprocessingCanvas" xmlns:cx="http://schemas.microsoft.com/office/drawing/2014/chartex" xmlns:cx1="http://schemas.microsoft.com/office/drawing/2015/9/8/chartex" xmlns:cx2="http://schemas.microsoft.com/office/drawing/2015/10/21/chartex" xmlns:cx3="http://schemas.microsoft.com/office/drawing/2016/5/9/chartex" xmlns:cx4="http://schemas.microsoft.com/office/drawing/2016/5/10/chartex" xmlns:cx5="http://schemas.microsoft.com/office/drawing/2016/5/11/chartex" xmlns:cx6="http://schemas.microsoft.com/office/drawing/2016/5/12/chartex" xmlns:cx7="http://schemas.microsoft.com/office/drawing/2016/5/13/chartex" xmlns:cx8="http://schemas.microsoft.com/office/drawing/2016/5/14/chartex" xmlns:mc="http://schemas.openxmlformats.org/markup-compatibility/2006" xmlns:m="http://schemas.openxmlformats.org/officeDocument/2006/math" xmlns:aink="http://schemas.microsoft.com/office/drawing/2016/ink" xmlns:am3d="http://schemas.microsoft.com/office/drawing/2017/model3d" xmlns:oel="http://schemas.microsoft.com/office/2019/extlst" xmlns:r="http://schemas.openxmlformats.org/officeDocument/2006/relationships" xmlns:wp14="http://schemas.microsoft.com/office/word/2010/wordprocessingDrawing" xmlns:wp="http://schemas.openxmlformats.org/drawingml/2006/wordprocessingDrawing" xmlns:wpg="http://schemas.microsoft.com/office/word/2010/wordprocessingGroup" xmlns:wpi="http://schemas.microsoft.com/office/word/2010/wordprocessingInk" xmlns:wps="http://schemas.microsoft.com/office/word/2010/wordprocessingShape" xmlns:o="urn:schemas-microsoft-com:office:office" xmlns:v="urn:schemas-microsoft-com:vml" xmlns:w10="urn:schemas-microsoft-com:office:word" xmlns:w="http://schemas.openxmlformats.org/wordprocessingml/2006/main" xmlns:w14="http://schemas.microsoft.com/office/word/2010/wordml" xmlns:w15="http://schemas.microsoft.com/office/word/2012/wordml" xmlns:w16cex="http://schemas.microsoft.com/office/word/2018/wordml/cex" xmlns:w16cid="http://schemas.microsoft.com/office/word/2016/wordml/cid" xmlns:w16="http://schemas.microsoft.com/office/word/2018/wordml" xmlns:w16sdtdh="http://schemas.microsoft.com/office/word/2020/wordml/sdtdatahash" xmlns:w16sdtfl="http://schemas.microsoft.com/office/word/2024/wordml/sdtformatlock" xmlns:w16se="http://schemas.microsoft.com/office/word/2015/wordml/symex" xmlns:w16du="http://schemas.microsoft.com/office/word/2023/wordml/word16du" xmlns:wne="http://schemas.microsoft.com/office/word/2006/wordml" mc:Ignorable="w14 w15 w16se w16cid w16 w16cex w16sdtdh w16sdtfl w16du wp14">
+<w:endnotes xmlns:wpc="http://schemas.microsoft.com/office/word/2010/wordprocessingCanvas" xmlns:cx="http://schemas.microsoft.com/office/drawing/2014/chartex" xmlns:cx1="http://schemas.microsoft.com/office/drawing/2015/9/8/chartex" xmlns:cx2="http://schemas.microsoft.com/office/drawing/2015/10/21/chartex" xmlns:cx3="http://schemas.microsoft.com/office/drawing/2016/5/9/chartex" xmlns:cx4="http://schemas.microsoft.com/office/drawing/2016/5/10/chartex" xmlns:cx5="http://schemas.microsoft.com/office/drawing/2016/5/11/chartex" xmlns:cx6="http://schemas.microsoft.com/office/drawing/2016/5/12/chartex" xmlns:cx7="http://schemas.microsoft.com/office/drawing/2016/5/13/chartex" xmlns:cx8="http://schemas.microsoft.com/office/drawing/2016/5/14/chartex" xmlns:mc="http://schemas.openxmlformats.org/markup-compatibility/2006" xmlns:aink="http://schemas.microsoft.com/office/drawing/2016/ink" xmlns:am3d="http://schemas.microsoft.com/office/drawing/2017/model3d" xmlns:o="urn:schemas-microsoft-com:office:office" xmlns:oel="http://schemas.microsoft.com/office/2019/extlst" xmlns:r="http://schemas.openxmlformats.org/officeDocument/2006/relationships" xmlns:m="http://schemas.openxmlformats.org/officeDocument/2006/math" xmlns:v="urn:schemas-microsoft-com:vml" xmlns:wp14="http://schemas.microsoft.com/office/word/2010/wordprocessingDrawing" xmlns:wp="http://schemas.openxmlformats.org/drawingml/2006/wordprocessingDrawing" xmlns:w10="urn:schemas-microsoft-com:office:word" xmlns:w="http://schemas.openxmlformats.org/wordprocessingml/2006/main" xmlns:w14="http://schemas.microsoft.com/office/word/2010/wordml" xmlns:w15="http://schemas.microsoft.com/office/word/2012/wordml" xmlns:w16cex="http://schemas.microsoft.com/office/word/2018/wordml/cex" xmlns:w16cid="http://schemas.microsoft.com/office/word/2016/wordml/cid" xmlns:w16="http://schemas.microsoft.com/office/word/2018/wordml" xmlns:w16du="http://schemas.microsoft.com/office/word/2023/wordml/word16du" xmlns:w16sdtdh="http://schemas.microsoft.com/office/word/2020/wordml/sdtdatahash" xmlns:w16sdtfl="http://schemas.microsoft.com/office/word/2024/wordml/sdtformatlock" xmlns:w16se="http://schemas.microsoft.com/office/word/2015/wordml/symex" xmlns:wpg="http://schemas.microsoft.com/office/word/2010/wordprocessingGroup" xmlns:wpi="http://schemas.microsoft.com/office/word/2010/wordprocessingInk" xmlns:wne="http://schemas.microsoft.com/office/word/2006/wordml" xmlns:wps="http://schemas.microsoft.com/office/word/2010/wordprocessingShape" mc:Ignorable="w14 w15 w16se w16cid w16 w16cex w16sdtdh w16sdtfl w16du wp14">
   <w:endnote w:type="separator" w:id="-1">
     <w:p>
       <w:pPr>
@@ -26101,7 +26018,7 @@
 </file>
 
 <file path=word/footer1.xml><?xml version="1.0" encoding="utf-8"?>
-<w:ftr xmlns:wpc="http://schemas.microsoft.com/office/word/2010/wordprocessingCanvas" xmlns:cx="http://schemas.microsoft.com/office/drawing/2014/chartex" xmlns:cx1="http://schemas.microsoft.com/office/drawing/2015/9/8/chartex" xmlns:cx2="http://schemas.microsoft.com/office/drawing/2015/10/21/chartex" xmlns:cx3="http://schemas.microsoft.com/office/drawing/2016/5/9/chartex" xmlns:cx4="http://schemas.microsoft.com/office/drawing/2016/5/10/chartex" xmlns:cx5="http://schemas.microsoft.com/office/drawing/2016/5/11/chartex" xmlns:cx6="http://schemas.microsoft.com/office/drawing/2016/5/12/chartex" xmlns:cx7="http://schemas.microsoft.com/office/drawing/2016/5/13/chartex" xmlns:cx8="http://schemas.microsoft.com/office/drawing/2016/5/14/chartex" xmlns:mc="http://schemas.openxmlformats.org/markup-compatibility/2006" xmlns:m="http://schemas.openxmlformats.org/officeDocument/2006/math" xmlns:aink="http://schemas.microsoft.com/office/drawing/2016/ink" xmlns:am3d="http://schemas.microsoft.com/office/drawing/2017/model3d" xmlns:oel="http://schemas.microsoft.com/office/2019/extlst" xmlns:r="http://schemas.openxmlformats.org/officeDocument/2006/relationships" xmlns:wp14="http://schemas.microsoft.com/office/word/2010/wordprocessingDrawing" xmlns:wp="http://schemas.openxmlformats.org/drawingml/2006/wordprocessingDrawing" xmlns:wpg="http://schemas.microsoft.com/office/word/2010/wordprocessingGroup" xmlns:wpi="http://schemas.microsoft.com/office/word/2010/wordprocessingInk" xmlns:wps="http://schemas.microsoft.com/office/word/2010/wordprocessingShape" xmlns:o="urn:schemas-microsoft-com:office:office" xmlns:v="urn:schemas-microsoft-com:vml" xmlns:w10="urn:schemas-microsoft-com:office:word" xmlns:w="http://schemas.openxmlformats.org/wordprocessingml/2006/main" xmlns:w14="http://schemas.microsoft.com/office/word/2010/wordml" xmlns:w15="http://schemas.microsoft.com/office/word/2012/wordml" xmlns:w16cex="http://schemas.microsoft.com/office/word/2018/wordml/cex" xmlns:w16cid="http://schemas.microsoft.com/office/word/2016/wordml/cid" xmlns:w16="http://schemas.microsoft.com/office/word/2018/wordml" xmlns:w16sdtdh="http://schemas.microsoft.com/office/word/2020/wordml/sdtdatahash" xmlns:w16sdtfl="http://schemas.microsoft.com/office/word/2024/wordml/sdtformatlock" xmlns:w16se="http://schemas.microsoft.com/office/word/2015/wordml/symex" xmlns:w16du="http://schemas.microsoft.com/office/word/2023/wordml/word16du" xmlns:wne="http://schemas.microsoft.com/office/word/2006/wordml" mc:Ignorable="w14 w15 w16se w16cid w16 w16cex w16sdtdh w16sdtfl w16du wp14">
+<w:ftr xmlns:wpc="http://schemas.microsoft.com/office/word/2010/wordprocessingCanvas" xmlns:cx="http://schemas.microsoft.com/office/drawing/2014/chartex" xmlns:cx1="http://schemas.microsoft.com/office/drawing/2015/9/8/chartex" xmlns:cx2="http://schemas.microsoft.com/office/drawing/2015/10/21/chartex" xmlns:cx3="http://schemas.microsoft.com/office/drawing/2016/5/9/chartex" xmlns:cx4="http://schemas.microsoft.com/office/drawing/2016/5/10/chartex" xmlns:cx5="http://schemas.microsoft.com/office/drawing/2016/5/11/chartex" xmlns:cx6="http://schemas.microsoft.com/office/drawing/2016/5/12/chartex" xmlns:cx7="http://schemas.microsoft.com/office/drawing/2016/5/13/chartex" xmlns:cx8="http://schemas.microsoft.com/office/drawing/2016/5/14/chartex" xmlns:mc="http://schemas.openxmlformats.org/markup-compatibility/2006" xmlns:aink="http://schemas.microsoft.com/office/drawing/2016/ink" xmlns:am3d="http://schemas.microsoft.com/office/drawing/2017/model3d" xmlns:o="urn:schemas-microsoft-com:office:office" xmlns:oel="http://schemas.microsoft.com/office/2019/extlst" xmlns:r="http://schemas.openxmlformats.org/officeDocument/2006/relationships" xmlns:m="http://schemas.openxmlformats.org/officeDocument/2006/math" xmlns:v="urn:schemas-microsoft-com:vml" xmlns:wp14="http://schemas.microsoft.com/office/word/2010/wordprocessingDrawing" xmlns:wp="http://schemas.openxmlformats.org/drawingml/2006/wordprocessingDrawing" xmlns:w10="urn:schemas-microsoft-com:office:word" xmlns:w="http://schemas.openxmlformats.org/wordprocessingml/2006/main" xmlns:w14="http://schemas.microsoft.com/office/word/2010/wordml" xmlns:w15="http://schemas.microsoft.com/office/word/2012/wordml" xmlns:w16cex="http://schemas.microsoft.com/office/word/2018/wordml/cex" xmlns:w16cid="http://schemas.microsoft.com/office/word/2016/wordml/cid" xmlns:w16="http://schemas.microsoft.com/office/word/2018/wordml" xmlns:w16du="http://schemas.microsoft.com/office/word/2023/wordml/word16du" xmlns:w16sdtdh="http://schemas.microsoft.com/office/word/2020/wordml/sdtdatahash" xmlns:w16sdtfl="http://schemas.microsoft.com/office/word/2024/wordml/sdtformatlock" xmlns:w16se="http://schemas.microsoft.com/office/word/2015/wordml/symex" xmlns:wpg="http://schemas.microsoft.com/office/word/2010/wordprocessingGroup" xmlns:wpi="http://schemas.microsoft.com/office/word/2010/wordprocessingInk" xmlns:wne="http://schemas.microsoft.com/office/word/2006/wordml" xmlns:wps="http://schemas.microsoft.com/office/word/2010/wordprocessingShape" mc:Ignorable="w14 w15 w16se w16cid w16 w16cex w16sdtdh w16sdtfl w16du wp14">
   <w:p>
     <w:pPr>
       <w:pStyle w:val="Footer"/>
@@ -26119,7 +26036,7 @@
 </file>
 
 <file path=word/footnotes.xml><?xml version="1.0" encoding="utf-8"?>
-<w:footnotes xmlns:wpc="http://schemas.microsoft.com/office/word/2010/wordprocessingCanvas" xmlns:cx="http://schemas.microsoft.com/office/drawing/2014/chartex" xmlns:cx1="http://schemas.microsoft.com/office/drawing/2015/9/8/chartex" xmlns:cx2="http://schemas.microsoft.com/office/drawing/2015/10/21/chartex" xmlns:cx3="http://schemas.microsoft.com/office/drawing/2016/5/9/chartex" xmlns:cx4="http://schemas.microsoft.com/office/drawing/2016/5/10/chartex" xmlns:cx5="http://schemas.microsoft.com/office/drawing/2016/5/11/chartex" xmlns:cx6="http://schemas.microsoft.com/office/drawing/2016/5/12/chartex" xmlns:cx7="http://schemas.microsoft.com/office/drawing/2016/5/13/chartex" xmlns:cx8="http://schemas.microsoft.com/office/drawing/2016/5/14/chartex" xmlns:mc="http://schemas.openxmlformats.org/markup-compatibility/2006" xmlns:m="http://schemas.openxmlformats.org/officeDocument/2006/math" xmlns:aink="http://schemas.microsoft.com/office/drawing/2016/ink" xmlns:am3d="http://schemas.microsoft.com/office/drawing/2017/model3d" xmlns:oel="http://schemas.microsoft.com/office/2019/extlst" xmlns:r="http://schemas.openxmlformats.org/officeDocument/2006/relationships" xmlns:wp14="http://schemas.microsoft.com/office/word/2010/wordprocessingDrawing" xmlns:wp="http://schemas.openxmlformats.org/drawingml/2006/wordprocessingDrawing" xmlns:wpg="http://schemas.microsoft.com/office/word/2010/wordprocessingGroup" xmlns:wpi="http://schemas.microsoft.com/office/word/2010/wordprocessingInk" xmlns:wps="http://schemas.microsoft.com/office/word/2010/wordprocessingShape" xmlns:o="urn:schemas-microsoft-com:office:office" xmlns:v="urn:schemas-microsoft-com:vml" xmlns:w10="urn:schemas-microsoft-com:office:word" xmlns:w="http://schemas.openxmlformats.org/wordprocessingml/2006/main" xmlns:w14="http://schemas.microsoft.com/office/word/2010/wordml" xmlns:w15="http://schemas.microsoft.com/office/word/2012/wordml" xmlns:w16cex="http://schemas.microsoft.com/office/word/2018/wordml/cex" xmlns:w16cid="http://schemas.microsoft.com/office/word/2016/wordml/cid" xmlns:w16="http://schemas.microsoft.com/office/word/2018/wordml" xmlns:w16sdtdh="http://schemas.microsoft.com/office/word/2020/wordml/sdtdatahash" xmlns:w16sdtfl="http://schemas.microsoft.com/office/word/2024/wordml/sdtformatlock" xmlns:w16se="http://schemas.microsoft.com/office/word/2015/wordml/symex" xmlns:w16du="http://schemas.microsoft.com/office/word/2023/wordml/word16du" xmlns:wne="http://schemas.microsoft.com/office/word/2006/wordml" mc:Ignorable="w14 w15 w16se w16cid w16 w16cex w16sdtdh w16sdtfl w16du wp14">
+<w:footnotes xmlns:wpc="http://schemas.microsoft.com/office/word/2010/wordprocessingCanvas" xmlns:cx="http://schemas.microsoft.com/office/drawing/2014/chartex" xmlns:cx1="http://schemas.microsoft.com/office/drawing/2015/9/8/chartex" xmlns:cx2="http://schemas.microsoft.com/office/drawing/2015/10/21/chartex" xmlns:cx3="http://schemas.microsoft.com/office/drawing/2016/5/9/chartex" xmlns:cx4="http://schemas.microsoft.com/office/drawing/2016/5/10/chartex" xmlns:cx5="http://schemas.microsoft.com/office/drawing/2016/5/11/chartex" xmlns:cx6="http://schemas.microsoft.com/office/drawing/2016/5/12/chartex" xmlns:cx7="http://schemas.microsoft.com/office/drawing/2016/5/13/chartex" xmlns:cx8="http://schemas.microsoft.com/office/drawing/2016/5/14/chartex" xmlns:mc="http://schemas.openxmlformats.org/markup-compatibility/2006" xmlns:aink="http://schemas.microsoft.com/office/drawing/2016/ink" xmlns:am3d="http://schemas.microsoft.com/office/drawing/2017/model3d" xmlns:o="urn:schemas-microsoft-com:office:office" xmlns:oel="http://schemas.microsoft.com/office/2019/extlst" xmlns:r="http://schemas.openxmlformats.org/officeDocument/2006/relationships" xmlns:m="http://schemas.openxmlformats.org/officeDocument/2006/math" xmlns:v="urn:schemas-microsoft-com:vml" xmlns:wp14="http://schemas.microsoft.com/office/word/2010/wordprocessingDrawing" xmlns:wp="http://schemas.openxmlformats.org/drawingml/2006/wordprocessingDrawing" xmlns:w10="urn:schemas-microsoft-com:office:word" xmlns:w="http://schemas.openxmlformats.org/wordprocessingml/2006/main" xmlns:w14="http://schemas.microsoft.com/office/word/2010/wordml" xmlns:w15="http://schemas.microsoft.com/office/word/2012/wordml" xmlns:w16cex="http://schemas.microsoft.com/office/word/2018/wordml/cex" xmlns:w16cid="http://schemas.microsoft.com/office/word/2016/wordml/cid" xmlns:w16="http://schemas.microsoft.com/office/word/2018/wordml" xmlns:w16du="http://schemas.microsoft.com/office/word/2023/wordml/word16du" xmlns:w16sdtdh="http://schemas.microsoft.com/office/word/2020/wordml/sdtdatahash" xmlns:w16sdtfl="http://schemas.microsoft.com/office/word/2024/wordml/sdtformatlock" xmlns:w16se="http://schemas.microsoft.com/office/word/2015/wordml/symex" xmlns:wpg="http://schemas.microsoft.com/office/word/2010/wordprocessingGroup" xmlns:wpi="http://schemas.microsoft.com/office/word/2010/wordprocessingInk" xmlns:wne="http://schemas.microsoft.com/office/word/2006/wordml" xmlns:wps="http://schemas.microsoft.com/office/word/2010/wordprocessingShape" mc:Ignorable="w14 w15 w16se w16cid w16 w16cex w16sdtdh w16sdtfl w16du wp14">
   <w:footnote w:type="separator" w:id="-1">
     <w:p>
       <w:pPr>
@@ -26144,7 +26061,7 @@
 </file>
 
 <file path=word/numbering.xml><?xml version="1.0" encoding="utf-8"?>
-<w:numbering xmlns:wpc="http://schemas.microsoft.com/office/word/2010/wordprocessingCanvas" xmlns:cx="http://schemas.microsoft.com/office/drawing/2014/chartex" xmlns:cx1="http://schemas.microsoft.com/office/drawing/2015/9/8/chartex" xmlns:cx2="http://schemas.microsoft.com/office/drawing/2015/10/21/chartex" xmlns:cx3="http://schemas.microsoft.com/office/drawing/2016/5/9/chartex" xmlns:cx4="http://schemas.microsoft.com/office/drawing/2016/5/10/chartex" xmlns:cx5="http://schemas.microsoft.com/office/drawing/2016/5/11/chartex" xmlns:cx6="http://schemas.microsoft.com/office/drawing/2016/5/12/chartex" xmlns:cx7="http://schemas.microsoft.com/office/drawing/2016/5/13/chartex" xmlns:cx8="http://schemas.microsoft.com/office/drawing/2016/5/14/chartex" xmlns:mc="http://schemas.openxmlformats.org/markup-compatibility/2006" xmlns:m="http://schemas.openxmlformats.org/officeDocument/2006/math" xmlns:aink="http://schemas.microsoft.com/office/drawing/2016/ink" xmlns:am3d="http://schemas.microsoft.com/office/drawing/2017/model3d" xmlns:oel="http://schemas.microsoft.com/office/2019/extlst" xmlns:r="http://schemas.openxmlformats.org/officeDocument/2006/relationships" xmlns:wp14="http://schemas.microsoft.com/office/word/2010/wordprocessingDrawing" xmlns:wp="http://schemas.openxmlformats.org/drawingml/2006/wordprocessingDrawing" xmlns:wpg="http://schemas.microsoft.com/office/word/2010/wordprocessingGroup" xmlns:wpi="http://schemas.microsoft.com/office/word/2010/wordprocessingInk" xmlns:wps="http://schemas.microsoft.com/office/word/2010/wordprocessingShape" xmlns:o="urn:schemas-microsoft-com:office:office" xmlns:v="urn:schemas-microsoft-com:vml" xmlns:w10="urn:schemas-microsoft-com:office:word" xmlns:w="http://schemas.openxmlformats.org/wordprocessingml/2006/main" xmlns:w14="http://schemas.microsoft.com/office/word/2010/wordml" xmlns:w15="http://schemas.microsoft.com/office/word/2012/wordml" xmlns:w16cex="http://schemas.microsoft.com/office/word/2018/wordml/cex" xmlns:w16cid="http://schemas.microsoft.com/office/word/2016/wordml/cid" xmlns:w16="http://schemas.microsoft.com/office/word/2018/wordml" xmlns:w16sdtdh="http://schemas.microsoft.com/office/word/2020/wordml/sdtdatahash" xmlns:w16sdtfl="http://schemas.microsoft.com/office/word/2024/wordml/sdtformatlock" xmlns:w16se="http://schemas.microsoft.com/office/word/2015/wordml/symex" xmlns:w16du="http://schemas.microsoft.com/office/word/2023/wordml/word16du" xmlns:wne="http://schemas.microsoft.com/office/word/2006/wordml" mc:Ignorable="w14 w15 w16se w16cid w16 w16cex w16sdtdh w16sdtfl w16du wp14">
+<w:numbering xmlns:wpc="http://schemas.microsoft.com/office/word/2010/wordprocessingCanvas" xmlns:cx="http://schemas.microsoft.com/office/drawing/2014/chartex" xmlns:cx1="http://schemas.microsoft.com/office/drawing/2015/9/8/chartex" xmlns:cx2="http://schemas.microsoft.com/office/drawing/2015/10/21/chartex" xmlns:cx3="http://schemas.microsoft.com/office/drawing/2016/5/9/chartex" xmlns:cx4="http://schemas.microsoft.com/office/drawing/2016/5/10/chartex" xmlns:cx5="http://schemas.microsoft.com/office/drawing/2016/5/11/chartex" xmlns:cx6="http://schemas.microsoft.com/office/drawing/2016/5/12/chartex" xmlns:cx7="http://schemas.microsoft.com/office/drawing/2016/5/13/chartex" xmlns:cx8="http://schemas.microsoft.com/office/drawing/2016/5/14/chartex" xmlns:mc="http://schemas.openxmlformats.org/markup-compatibility/2006" xmlns:aink="http://schemas.microsoft.com/office/drawing/2016/ink" xmlns:am3d="http://schemas.microsoft.com/office/drawing/2017/model3d" xmlns:o="urn:schemas-microsoft-com:office:office" xmlns:oel="http://schemas.microsoft.com/office/2019/extlst" xmlns:r="http://schemas.openxmlformats.org/officeDocument/2006/relationships" xmlns:m="http://schemas.openxmlformats.org/officeDocument/2006/math" xmlns:v="urn:schemas-microsoft-com:vml" xmlns:wp14="http://schemas.microsoft.com/office/word/2010/wordprocessingDrawing" xmlns:wp="http://schemas.openxmlformats.org/drawingml/2006/wordprocessingDrawing" xmlns:w10="urn:schemas-microsoft-com:office:word" xmlns:w="http://schemas.openxmlformats.org/wordprocessingml/2006/main" xmlns:w14="http://schemas.microsoft.com/office/word/2010/wordml" xmlns:w15="http://schemas.microsoft.com/office/word/2012/wordml" xmlns:w16cex="http://schemas.microsoft.com/office/word/2018/wordml/cex" xmlns:w16cid="http://schemas.microsoft.com/office/word/2016/wordml/cid" xmlns:w16="http://schemas.microsoft.com/office/word/2018/wordml" xmlns:w16du="http://schemas.microsoft.com/office/word/2023/wordml/word16du" xmlns:w16sdtdh="http://schemas.microsoft.com/office/word/2020/wordml/sdtdatahash" xmlns:w16sdtfl="http://schemas.microsoft.com/office/word/2024/wordml/sdtformatlock" xmlns:w16se="http://schemas.microsoft.com/office/word/2015/wordml/symex" xmlns:wpg="http://schemas.microsoft.com/office/word/2010/wordprocessingGroup" xmlns:wpi="http://schemas.microsoft.com/office/word/2010/wordprocessingInk" xmlns:wne="http://schemas.microsoft.com/office/word/2006/wordml" xmlns:wps="http://schemas.microsoft.com/office/word/2010/wordprocessingShape" mc:Ignorable="w14 w15 w16se w16cid w16 w16cex w16sdtdh w16sdtfl w16du wp14">
   <w:abstractNum w:abstractNumId="0" w15:restartNumberingAfterBreak="0">
     <w:nsid w:val="FFFFFF7C"/>
     <w:multiLevelType w:val="singleLevel"/>
@@ -26347,7 +26264,7 @@
 </file>
 
 <file path=word/styles.xml><?xml version="1.0" encoding="utf-8"?>
-<w:styles xmlns:mc="http://schemas.openxmlformats.org/markup-compatibility/2006" xmlns:r="http://schemas.openxmlformats.org/officeDocument/2006/relationships" xmlns:w="http://schemas.openxmlformats.org/wordprocessingml/2006/main" xmlns:w14="http://schemas.microsoft.com/office/word/2010/wordml" xmlns:w15="http://schemas.microsoft.com/office/word/2012/wordml" xmlns:w16cex="http://schemas.microsoft.com/office/word/2018/wordml/cex" xmlns:w16cid="http://schemas.microsoft.com/office/word/2016/wordml/cid" xmlns:w16="http://schemas.microsoft.com/office/word/2018/wordml" xmlns:w16sdtdh="http://schemas.microsoft.com/office/word/2020/wordml/sdtdatahash" xmlns:w16sdtfl="http://schemas.microsoft.com/office/word/2024/wordml/sdtformatlock" xmlns:w16se="http://schemas.microsoft.com/office/word/2015/wordml/symex" xmlns:w16du="http://schemas.microsoft.com/office/word/2023/wordml/word16du" mc:Ignorable="w14 w15 w16se w16cid w16 w16cex w16sdtdh w16sdtfl w16du">
+<w:styles xmlns:mc="http://schemas.openxmlformats.org/markup-compatibility/2006" xmlns:r="http://schemas.openxmlformats.org/officeDocument/2006/relationships" xmlns:w="http://schemas.openxmlformats.org/wordprocessingml/2006/main" xmlns:w14="http://schemas.microsoft.com/office/word/2010/wordml" xmlns:w15="http://schemas.microsoft.com/office/word/2012/wordml" xmlns:w16cex="http://schemas.microsoft.com/office/word/2018/wordml/cex" xmlns:w16cid="http://schemas.microsoft.com/office/word/2016/wordml/cid" xmlns:w16="http://schemas.microsoft.com/office/word/2018/wordml" xmlns:w16du="http://schemas.microsoft.com/office/word/2023/wordml/word16du" xmlns:w16sdtdh="http://schemas.microsoft.com/office/word/2020/wordml/sdtdatahash" xmlns:w16sdtfl="http://schemas.microsoft.com/office/word/2024/wordml/sdtformatlock" xmlns:w16se="http://schemas.microsoft.com/office/word/2015/wordml/symex" mc:Ignorable="w14 w15 w16se w16cid w16 w16cex w16sdtdh w16sdtfl w16du">
   <w:docDefaults>
     <w:rPrDefault>
       <w:rPr>

</xml_diff>